<commit_message>
Guia presencial ajustada al reparto real: Geovanny 1-8, Piero 9-13, Anelys 14-16
</commit_message>
<xml_diff>
--- a/documentacion/Guia-Exposicion-Presencial.docx
+++ b/documentacion/Guia-Exposicion-Presencial.docx
@@ -526,7 +526,7 @@
         </w:tc>
         <w:tc>
           <w:tcPr>
-            <w:tcW w:type="dxa" w:w="2304"/>
+            <w:tcW w:type="dxa" w:w="2016"/>
             <w:shd w:val="clear" w:color="auto" w:fill="EDE9FE"/>
           </w:tcPr>
           <w:p>
@@ -560,7 +560,7 @@
                 <w:rFonts w:ascii="Calibri" w:hAnsi="Calibri"/>
                 <w:sz w:val="19"/>
               </w:rPr>
-              <w:t>0:00 – 0:40</w:t>
+              <w:t>0:00 – 0:35</w:t>
             </w:r>
           </w:p>
         </w:tc>
@@ -596,13 +596,13 @@
                 <w:rFonts w:ascii="Calibri" w:hAnsi="Calibri"/>
                 <w:sz w:val="19"/>
               </w:rPr>
-              <w:t>Presentación y objetivos</w:t>
+              <w:t>Portada y objetivos</w:t>
             </w:r>
           </w:p>
         </w:tc>
         <w:tc>
           <w:tcPr>
-            <w:tcW w:type="dxa" w:w="2304"/>
+            <w:tcW w:type="dxa" w:w="2016"/>
           </w:tcPr>
           <w:p>
             <w:pPr>
@@ -614,7 +614,7 @@
                 <w:rFonts w:ascii="Calibri" w:hAnsi="Calibri"/>
                 <w:sz w:val="19"/>
               </w:rPr>
-              <w:t>Anelys</w:t>
+              <w:t>Geovanny</w:t>
             </w:r>
           </w:p>
         </w:tc>
@@ -634,7 +634,7 @@
                 <w:rFonts w:ascii="Calibri" w:hAnsi="Calibri"/>
                 <w:sz w:val="19"/>
               </w:rPr>
-              <w:t>0:40 – 2:00</w:t>
+              <w:t>0:35 – 1:25</w:t>
             </w:r>
           </w:p>
         </w:tc>
@@ -670,13 +670,13 @@
                 <w:rFonts w:ascii="Calibri" w:hAnsi="Calibri"/>
                 <w:sz w:val="19"/>
               </w:rPr>
-              <w:t>Qué es LAMP, hosts virtuales y permisos</w:t>
+              <w:t>La pila LAMP · hosts virtuales y permisos</w:t>
             </w:r>
           </w:p>
         </w:tc>
         <w:tc>
           <w:tcPr>
-            <w:tcW w:type="dxa" w:w="2304"/>
+            <w:tcW w:type="dxa" w:w="2016"/>
           </w:tcPr>
           <w:p>
             <w:pPr>
@@ -688,7 +688,7 @@
                 <w:rFonts w:ascii="Calibri" w:hAnsi="Calibri"/>
                 <w:sz w:val="19"/>
               </w:rPr>
-              <w:t>Piero</w:t>
+              <w:t>Geovanny</w:t>
             </w:r>
           </w:p>
         </w:tc>
@@ -708,7 +708,7 @@
                 <w:rFonts w:ascii="Calibri" w:hAnsi="Calibri"/>
                 <w:sz w:val="19"/>
               </w:rPr>
-              <w:t>2:00 – 3:40</w:t>
+              <w:t>1:25 – 2:30</w:t>
             </w:r>
           </w:p>
         </w:tc>
@@ -726,7 +726,7 @@
                 <w:rFonts w:ascii="Calibri" w:hAnsi="Calibri"/>
                 <w:sz w:val="19"/>
               </w:rPr>
-              <w:t>5 – 8</w:t>
+              <w:t>5 – 6</w:t>
             </w:r>
           </w:p>
         </w:tc>
@@ -744,13 +744,13 @@
                 <w:rFonts w:ascii="Calibri" w:hAnsi="Calibri"/>
                 <w:sz w:val="19"/>
               </w:rPr>
-              <w:t>Entorno, datos, despliegue y endurecimiento</w:t>
+              <w:t>Entorno de despliegue y modelo de datos</w:t>
             </w:r>
           </w:p>
         </w:tc>
         <w:tc>
           <w:tcPr>
-            <w:tcW w:type="dxa" w:w="2304"/>
+            <w:tcW w:type="dxa" w:w="2016"/>
           </w:tcPr>
           <w:p>
             <w:pPr>
@@ -762,7 +762,7 @@
                 <w:rFonts w:ascii="Calibri" w:hAnsi="Calibri"/>
                 <w:sz w:val="19"/>
               </w:rPr>
-              <w:t>Daniel</w:t>
+              <w:t>Geovanny</w:t>
             </w:r>
           </w:p>
         </w:tc>
@@ -782,7 +782,155 @@
                 <w:rFonts w:ascii="Calibri" w:hAnsi="Calibri"/>
                 <w:sz w:val="19"/>
               </w:rPr>
-              <w:t>3:40 – 4:40</w:t>
+              <w:t>2:30 – 3:30</w:t>
+            </w:r>
+          </w:p>
+        </w:tc>
+        <w:tc>
+          <w:tcPr>
+            <w:tcW w:type="dxa" w:w="1368"/>
+          </w:tcPr>
+          <w:p>
+            <w:pPr>
+              <w:spacing w:after="30" w:before="30"/>
+            </w:pPr>
+            <w:r/>
+            <w:r>
+              <w:rPr>
+                <w:rFonts w:ascii="Calibri" w:hAnsi="Calibri"/>
+                <w:sz w:val="19"/>
+              </w:rPr>
+              <w:t>7 – 8</w:t>
+            </w:r>
+          </w:p>
+        </w:tc>
+        <w:tc>
+          <w:tcPr>
+            <w:tcW w:type="dxa" w:w="4464"/>
+          </w:tcPr>
+          <w:p>
+            <w:pPr>
+              <w:spacing w:after="30" w:before="30"/>
+            </w:pPr>
+            <w:r/>
+            <w:r>
+              <w:rPr>
+                <w:rFonts w:ascii="Calibri" w:hAnsi="Calibri"/>
+                <w:sz w:val="19"/>
+              </w:rPr>
+              <w:t>Despliegue en 7 etapas y endurecimiento</w:t>
+            </w:r>
+          </w:p>
+        </w:tc>
+        <w:tc>
+          <w:tcPr>
+            <w:tcW w:type="dxa" w:w="2016"/>
+          </w:tcPr>
+          <w:p>
+            <w:pPr>
+              <w:spacing w:after="30" w:before="30"/>
+            </w:pPr>
+            <w:r/>
+            <w:r>
+              <w:rPr>
+                <w:rFonts w:ascii="Calibri" w:hAnsi="Calibri"/>
+                <w:sz w:val="19"/>
+              </w:rPr>
+              <w:t>Geovanny</w:t>
+            </w:r>
+          </w:p>
+        </w:tc>
+      </w:tr>
+      <w:tr>
+        <w:tc>
+          <w:tcPr>
+            <w:tcW w:type="dxa" w:w="1512"/>
+          </w:tcPr>
+          <w:p>
+            <w:pPr>
+              <w:spacing w:after="30" w:before="30"/>
+            </w:pPr>
+            <w:r/>
+            <w:r>
+              <w:rPr>
+                <w:rFonts w:ascii="Calibri" w:hAnsi="Calibri"/>
+                <w:sz w:val="19"/>
+              </w:rPr>
+              <w:t>3:30 – 4:45</w:t>
+            </w:r>
+          </w:p>
+        </w:tc>
+        <w:tc>
+          <w:tcPr>
+            <w:tcW w:type="dxa" w:w="1368"/>
+          </w:tcPr>
+          <w:p>
+            <w:pPr>
+              <w:spacing w:after="30" w:before="30"/>
+            </w:pPr>
+            <w:r/>
+            <w:r>
+              <w:rPr>
+                <w:rFonts w:ascii="Calibri" w:hAnsi="Calibri"/>
+                <w:sz w:val="19"/>
+              </w:rPr>
+              <w:t>—</w:t>
+            </w:r>
+          </w:p>
+        </w:tc>
+        <w:tc>
+          <w:tcPr>
+            <w:tcW w:type="dxa" w:w="4464"/>
+          </w:tcPr>
+          <w:p>
+            <w:pPr>
+              <w:spacing w:after="30" w:before="30"/>
+            </w:pPr>
+            <w:r/>
+            <w:r>
+              <w:rPr>
+                <w:rFonts w:ascii="Calibri" w:hAnsi="Calibri"/>
+                <w:sz w:val="19"/>
+              </w:rPr>
+              <w:t>DEMOSTRACIÓN EN EL SERVIDOR (terminal)</w:t>
+            </w:r>
+          </w:p>
+        </w:tc>
+        <w:tc>
+          <w:tcPr>
+            <w:tcW w:type="dxa" w:w="2016"/>
+          </w:tcPr>
+          <w:p>
+            <w:pPr>
+              <w:spacing w:after="30" w:before="30"/>
+            </w:pPr>
+            <w:r/>
+            <w:r>
+              <w:rPr>
+                <w:rFonts w:ascii="Calibri" w:hAnsi="Calibri"/>
+                <w:sz w:val="19"/>
+              </w:rPr>
+              <w:t>Geovanny</w:t>
+            </w:r>
+          </w:p>
+        </w:tc>
+      </w:tr>
+      <w:tr>
+        <w:tc>
+          <w:tcPr>
+            <w:tcW w:type="dxa" w:w="1512"/>
+          </w:tcPr>
+          <w:p>
+            <w:pPr>
+              <w:spacing w:after="30" w:before="30"/>
+            </w:pPr>
+            <w:r/>
+            <w:r>
+              <w:rPr>
+                <w:rFonts w:ascii="Calibri" w:hAnsi="Calibri"/>
+                <w:sz w:val="19"/>
+              </w:rPr>
+              <w:t>4:45 – 5:45</w:t>
             </w:r>
           </w:p>
         </w:tc>
@@ -818,13 +966,13 @@
                 <w:rFonts w:ascii="Calibri" w:hAnsi="Calibri"/>
                 <w:sz w:val="19"/>
               </w:rPr>
-              <w:t>Resultados y cumplimiento</w:t>
+              <w:t>Verificación, prueba integral y cumplimiento</w:t>
             </w:r>
           </w:p>
         </w:tc>
         <w:tc>
           <w:tcPr>
-            <w:tcW w:type="dxa" w:w="2304"/>
+            <w:tcW w:type="dxa" w:w="2016"/>
           </w:tcPr>
           <w:p>
             <w:pPr>
@@ -856,7 +1004,7 @@
                 <w:rFonts w:ascii="Calibri" w:hAnsi="Calibri"/>
                 <w:sz w:val="19"/>
               </w:rPr>
-              <w:t>4:40 – 8:00</w:t>
+              <w:t>5:45 – 8:15</w:t>
             </w:r>
           </w:p>
         </w:tc>
@@ -892,87 +1040,13 @@
                 <w:rFonts w:ascii="Calibri" w:hAnsi="Calibri"/>
                 <w:sz w:val="19"/>
               </w:rPr>
-              <w:t>DEMOSTRACIÓN EN VIVO</w:t>
+              <w:t>DEMOSTRACIÓN DEL SITIO (navegador)</w:t>
             </w:r>
           </w:p>
         </w:tc>
         <w:tc>
           <w:tcPr>
-            <w:tcW w:type="dxa" w:w="2304"/>
-          </w:tcPr>
-          <w:p>
-            <w:pPr>
-              <w:spacing w:after="30" w:before="30"/>
-            </w:pPr>
-            <w:r/>
-            <w:r>
-              <w:rPr>
-                <w:rFonts w:ascii="Calibri" w:hAnsi="Calibri"/>
-                <w:sz w:val="19"/>
-              </w:rPr>
-              <w:t>Anelys + Daniel</w:t>
-            </w:r>
-          </w:p>
-        </w:tc>
-      </w:tr>
-      <w:tr>
-        <w:tc>
-          <w:tcPr>
-            <w:tcW w:type="dxa" w:w="1512"/>
-          </w:tcPr>
-          <w:p>
-            <w:pPr>
-              <w:spacing w:after="30" w:before="30"/>
-            </w:pPr>
-            <w:r/>
-            <w:r>
-              <w:rPr>
-                <w:rFonts w:ascii="Calibri" w:hAnsi="Calibri"/>
-                <w:sz w:val="19"/>
-              </w:rPr>
-              <w:t>8:00 – 8:40</w:t>
-            </w:r>
-          </w:p>
-        </w:tc>
-        <w:tc>
-          <w:tcPr>
-            <w:tcW w:type="dxa" w:w="1368"/>
-          </w:tcPr>
-          <w:p>
-            <w:pPr>
-              <w:spacing w:after="30" w:before="30"/>
-            </w:pPr>
-            <w:r/>
-            <w:r>
-              <w:rPr>
-                <w:rFonts w:ascii="Calibri" w:hAnsi="Calibri"/>
-                <w:sz w:val="19"/>
-              </w:rPr>
-              <w:t>14</w:t>
-            </w:r>
-          </w:p>
-        </w:tc>
-        <w:tc>
-          <w:tcPr>
-            <w:tcW w:type="dxa" w:w="4464"/>
-          </w:tcPr>
-          <w:p>
-            <w:pPr>
-              <w:spacing w:after="30" w:before="30"/>
-            </w:pPr>
-            <w:r/>
-            <w:r>
-              <w:rPr>
-                <w:rFonts w:ascii="Calibri" w:hAnsi="Calibri"/>
-                <w:sz w:val="19"/>
-              </w:rPr>
-              <w:t>Limitaciones y plan de acción</w:t>
-            </w:r>
-          </w:p>
-        </w:tc>
-        <w:tc>
-          <w:tcPr>
-            <w:tcW w:type="dxa" w:w="2304"/>
+            <w:tcW w:type="dxa" w:w="2016"/>
           </w:tcPr>
           <w:p>
             <w:pPr>
@@ -1004,7 +1078,7 @@
                 <w:rFonts w:ascii="Calibri" w:hAnsi="Calibri"/>
                 <w:sz w:val="19"/>
               </w:rPr>
-              <w:t>8:40 – 10:00</w:t>
+              <w:t>8:15 – 10:00</w:t>
             </w:r>
           </w:p>
         </w:tc>
@@ -1022,7 +1096,7 @@
                 <w:rFonts w:ascii="Calibri" w:hAnsi="Calibri"/>
                 <w:sz w:val="19"/>
               </w:rPr>
-              <w:t>15 – 16</w:t>
+              <w:t>14 – 16</w:t>
             </w:r>
           </w:p>
         </w:tc>
@@ -1040,13 +1114,13 @@
                 <w:rFonts w:ascii="Calibri" w:hAnsi="Calibri"/>
                 <w:sz w:val="19"/>
               </w:rPr>
-              <w:t>Conclusiones y cierre</w:t>
+              <w:t>Limitaciones, conclusiones y cierre</w:t>
             </w:r>
           </w:p>
         </w:tc>
         <w:tc>
           <w:tcPr>
-            <w:tcW w:type="dxa" w:w="2304"/>
+            <w:tcW w:type="dxa" w:w="2016"/>
           </w:tcPr>
           <w:p>
             <w:pPr>
@@ -1080,7 +1154,34 @@
           <w:b/>
           <w:sz w:val="21"/>
         </w:rPr>
-        <w:t>La demostración se lleva un tercio del tiempo, y está bien: es lo único que el jurado no puede leer después en el informe.</w:t>
+        <w:t>Las dos demostraciones se llevan casi cuatro minutos entre ambas, y está bien: son lo único que el jurado no puede leer después en el informe.</w:t>
+      </w:r>
+    </w:p>
+    <w:p>
+      <w:pPr>
+        <w:spacing w:after="160"/>
+      </w:pPr>
+      <w:r>
+        <w:rPr>
+          <w:b w:val="0"/>
+          <w:i w:val="0"/>
+          <w:sz w:val="21"/>
+        </w:rPr>
+        <w:t>Dos observaciones sobre este reparto. Geovanny carga con la mitad de la exposición, así que es quien más necesita ensayar el ritmo. Y Anelys tiene el bloque más corto pero el más expuesto: el cierre es lo último que el jurado escucha y lo que más recuerda.</w:t>
+      </w:r>
+    </w:p>
+    <w:p>
+      <w:pPr>
+        <w:spacing w:before="80" w:after="180"/>
+        <w:ind w:left="216"/>
+        <w:shd w:val="clear" w:color="auto" w:fill="FEE2E2"/>
+      </w:pPr>
+      <w:r>
+        <w:rPr>
+          <w:b/>
+          <w:sz w:val="21"/>
+        </w:rPr>
+        <w:t>La demostración del servidor no tiene diapositiva propia. Va al final del bloque de Geovanny, justo después de explicar el endurecimiento: acaba de decir cómo aseguró el servidor y lo enseña funcionando. Es la transición más natural que permite el orden de las diapositivas.</w:t>
       </w:r>
     </w:p>
     <w:p>
@@ -1096,7 +1197,33 @@
         <w:pStyle w:val="Heading2"/>
       </w:pPr>
       <w:r>
-        <w:t>Diapositivas 1 y 2 · Presentación y objetivos  (Anelys)</w:t>
+        <w:t>GEOVANNY · Diapositivas 1 a 8  (los primeros 3:30)</w:t>
+      </w:r>
+    </w:p>
+    <w:p>
+      <w:pPr>
+        <w:spacing w:after="160"/>
+      </w:pPr>
+      <w:r>
+        <w:rPr>
+          <w:b w:val="0"/>
+          <w:i w:val="0"/>
+          <w:sz w:val="21"/>
+        </w:rPr>
+        <w:t>Ocho diapositivas en tres minutos y medio: unos veinticinco segundos cada una. La única manera de lograrlo es no leerlas. Todo lo que está escrito en pantalla el jurado ya lo lee solo; tu trabajo es decir lo que NO está escrito.</w:t>
+      </w:r>
+    </w:p>
+    <w:p>
+      <w:pPr>
+        <w:spacing w:after="40"/>
+      </w:pPr>
+      <w:r>
+        <w:rPr>
+          <w:b/>
+          <w:i w:val="0"/>
+          <w:sz w:val="21"/>
+        </w:rPr>
+        <w:t>Portada y objetivos (1–2) · 35 segundos</w:t>
       </w:r>
     </w:p>
     <w:p>
@@ -1109,7 +1236,7 @@
           <w:i w:val="0"/>
           <w:sz w:val="21"/>
         </w:rPr>
-        <w:t>Nombres del equipo y una frase con qué es el proyecto. No leas los cinco objetivos: están en pantalla y el jurado sabe leer. Di el general y salta al siguiente.</w:t>
+        <w:t>Nombres del equipo y una frase con qué es el proyecto. De los cinco objetivos di solo el general y sigue.</w:t>
       </w:r>
     </w:p>
     <w:p>
@@ -1128,10 +1255,15 @@
     </w:p>
     <w:p>
       <w:pPr>
-        <w:pStyle w:val="Heading2"/>
+        <w:spacing w:after="40"/>
       </w:pPr>
       <w:r>
-        <w:t>Diapositivas 3 y 4 · Fundamentación  (Piero)</w:t>
+        <w:rPr>
+          <w:b/>
+          <w:i w:val="0"/>
+          <w:sz w:val="21"/>
+        </w:rPr>
+        <w:t>La pila LAMP y los fundamentos (3–4) · 50 segundos</w:t>
       </w:r>
     </w:p>
     <w:p>
@@ -1144,7 +1276,7 @@
           <w:i w:val="0"/>
           <w:sz w:val="21"/>
         </w:rPr>
-        <w:t>Es la parte teórica y la que más rápido se debe pasar. Cuatro letras, cuatro funciones. Lo único que conviene subrayar es la frase que ya está en la diapositiva 3:</w:t>
+        <w:t>Cuatro letras, cuatro funciones, rápido. Lo único que conviene subrayar es la frase que ya está en la diapositiva 3:</w:t>
       </w:r>
     </w:p>
     <w:p>
@@ -1171,28 +1303,20 @@
           <w:i w:val="0"/>
           <w:sz w:val="21"/>
         </w:rPr>
-        <w:t>De la diapositiva 4 basta con una idea: un servidor puede alojar varios sitios y el host virtual decide cuál sirve. Eso prepara el terreno para explicar la convivencia con WordPress.</w:t>
+        <w:t>De la 4 basta una idea: un servidor puede alojar varios sitios y el host virtual decide cuál sirve. Eso te prepara el terreno para la convivencia con WordPress.</w:t>
       </w:r>
     </w:p>
     <w:p>
       <w:pPr>
-        <w:pStyle w:val="Heading2"/>
-      </w:pPr>
-      <w:r>
-        <w:t>Diapositivas 5 a 8 · Metodología  (Daniel)</w:t>
-      </w:r>
-    </w:p>
-    <w:p>
-      <w:pPr>
-        <w:spacing w:after="100"/>
+        <w:spacing w:after="40"/>
       </w:pPr>
       <w:r>
         <w:rPr>
-          <w:b w:val="0"/>
+          <w:b/>
           <w:i w:val="0"/>
           <w:sz w:val="21"/>
         </w:rPr>
-        <w:t>Es tu bloque más denso: cuatro diapositivas en cien segundos. No las recorras enteras.</w:t>
+        <w:t>Entorno y modelo de datos (5–6) · 65 segundos</w:t>
       </w:r>
     </w:p>
     <w:p>
@@ -1206,7 +1330,7 @@
           <w:rFonts w:ascii="Calibri" w:hAnsi="Calibri"/>
           <w:sz w:val="21"/>
         </w:rPr>
-        <w:t>Diapositiva 5: menciona solo las versiones y el puerto 8080. La estructura de archivos se ve sola.</w:t>
+        <w:t>De la 5, menciona solo las versiones y el puerto 8080. La estructura de archivos se ve sola.</w:t>
       </w:r>
     </w:p>
     <w:p>
@@ -1220,7 +1344,20 @@
           <w:rFonts w:ascii="Calibri" w:hAnsi="Calibri"/>
           <w:sz w:val="21"/>
         </w:rPr>
-        <w:t>Diapositiva 6: tres tablas, y el punto fuerte es el usuario de base de datos con permisos limitados.</w:t>
+        <w:t>De la 6, el punto fuerte no son las tres tablas sino el usuario de base de datos con permisos limitados.</w:t>
+      </w:r>
+    </w:p>
+    <w:p>
+      <w:pPr>
+        <w:spacing w:after="40"/>
+      </w:pPr>
+      <w:r>
+        <w:rPr>
+          <w:b/>
+          <w:i w:val="0"/>
+          <w:sz w:val="21"/>
+        </w:rPr>
+        <w:t>Despliegue y endurecimiento (7–8) · 60 segundos</w:t>
       </w:r>
     </w:p>
     <w:p>
@@ -1234,7 +1371,7 @@
           <w:rFonts w:ascii="Calibri" w:hAnsi="Calibri"/>
           <w:sz w:val="21"/>
         </w:rPr>
-        <w:t>Diapositiva 7: no leas las siete etapas. Di «siete etapas, cada una verificada antes de pasar a la siguiente» y detente en la tercera, la de permisos.</w:t>
+        <w:t>No leas las siete etapas. Di «siete etapas, cada una verificada antes de pasar a la siguiente» y detente solo en la tercera, la de permisos.</w:t>
       </w:r>
     </w:p>
     <w:p>
@@ -1248,7 +1385,7 @@
           <w:rFonts w:ascii="Calibri" w:hAnsi="Calibri"/>
           <w:sz w:val="21"/>
         </w:rPr>
-        <w:t>Diapositiva 8: elige dos medidas y explica el porqué. Las otras cuatro quedan en pantalla.</w:t>
+        <w:t>De las seis medidas de endurecimiento elige dos y explica el porqué. Las otras cuatro quedan en pantalla.</w:t>
       </w:r>
     </w:p>
     <w:p>
@@ -1267,10 +1404,23 @@
     </w:p>
     <w:p>
       <w:pPr>
+        <w:spacing w:after="100"/>
+      </w:pPr>
+      <w:r>
+        <w:rPr>
+          <w:b w:val="0"/>
+          <w:i w:val="0"/>
+          <w:sz w:val="21"/>
+        </w:rPr>
+        <w:t>Y con esa frase enlazas directo con tu demostración en la terminal.</w:t>
+      </w:r>
+    </w:p>
+    <w:p>
+      <w:pPr>
         <w:pStyle w:val="Heading2"/>
       </w:pPr>
       <w:r>
-        <w:t>Diapositivas 9 a 11 · Resultados  (Piero)</w:t>
+        <w:t>PIERO · Diapositivas 9 a 11  (un minuto)</w:t>
       </w:r>
     </w:p>
     <w:p>
@@ -1311,7 +1461,7 @@
           <w:rFonts w:ascii="Calibri" w:hAnsi="Calibri"/>
           <w:sz w:val="21"/>
         </w:rPr>
-        <w:t>«23 de 23 requisitos»: y ahí haces la transición a la demostración.</w:t>
+        <w:t>«23 de 23 requisitos», y ahí haces la transición a tu demostración.</w:t>
       </w:r>
     </w:p>
     <w:p>
@@ -1330,10 +1480,23 @@
     </w:p>
     <w:p>
       <w:pPr>
+        <w:spacing w:after="100"/>
+      </w:pPr>
+      <w:r>
+        <w:rPr>
+          <w:b w:val="0"/>
+          <w:i w:val="0"/>
+          <w:sz w:val="21"/>
+        </w:rPr>
+        <w:t>Un aviso sobre la diapositiva 10: describe la prueba integral con nombres de tabla que no coinciden con la base de datos real. Corrígela antes o no la detalles en voz alta.</w:t>
+      </w:r>
+    </w:p>
+    <w:p>
+      <w:pPr>
         <w:pStyle w:val="Heading1"/>
       </w:pPr>
       <w:r>
-        <w:t>La demostración en vivo  ·  minutos 4:40 a 8:00</w:t>
+        <w:t>Las dos demostraciones en vivo</w:t>
       </w:r>
     </w:p>
     <w:p>
@@ -1346,7 +1509,7 @@
           <w:i w:val="0"/>
           <w:sz w:val="21"/>
         </w:rPr>
-        <w:t>Este es el bloque que decide la nota. Las diapositivas 12 y 13 tienen capturas, pero úsalas solo como respaldo: navega el sitio de verdad.</w:t>
+        <w:t>Son el bloque que decide la nota, y van separadas: Geovanny cierra su parte enseñando el servidor, y Piero abre la suya enseñando el sitio.</w:t>
       </w:r>
     </w:p>
     <w:p>
@@ -1354,7 +1517,7 @@
         <w:pStyle w:val="Heading2"/>
       </w:pPr>
       <w:r>
-        <w:t>Parte A · El sitio  (Anelys, unos 100 segundos)</w:t>
+        <w:t>GEOVANNY · El servidor  ·  minutos 3:30 a 4:45</w:t>
       </w:r>
     </w:p>
     <w:p>
@@ -1367,7 +1530,111 @@
           <w:i w:val="0"/>
           <w:sz w:val="21"/>
         </w:rPr>
-        <w:t>Alt + Tab al navegador. Recorrido sin detenerse, en este orden:</w:t>
+        <w:t>Acabas de explicar el endurecimiento. Ahora lo enseñas. Alt + Tab a PuTTY y estos comandos, en este orden y ya practicados:</w:t>
+      </w:r>
+    </w:p>
+    <w:p>
+      <w:pPr>
+        <w:spacing w:after="40"/>
+        <w:ind w:left="288"/>
+        <w:shd w:val="clear" w:color="auto" w:fill="F3F4F6"/>
+      </w:pPr>
+      <w:r>
+        <w:rPr>
+          <w:rFonts w:ascii="Consolas" w:hAnsi="Consolas"/>
+          <w:sz w:val="19"/>
+        </w:rPr>
+        <w:t>whoami &amp;&amp; hostname &amp;&amp; lsb_release -d</w:t>
+      </w:r>
+    </w:p>
+    <w:p>
+      <w:pPr>
+        <w:spacing w:after="40"/>
+        <w:ind w:left="288"/>
+        <w:shd w:val="clear" w:color="auto" w:fill="F3F4F6"/>
+      </w:pPr>
+      <w:r>
+        <w:rPr>
+          <w:rFonts w:ascii="Consolas" w:hAnsi="Consolas"/>
+          <w:sz w:val="19"/>
+        </w:rPr>
+        <w:t>apache2 -v &amp;&amp; mysql --version &amp;&amp; php -v</w:t>
+      </w:r>
+    </w:p>
+    <w:p>
+      <w:pPr>
+        <w:spacing w:after="40"/>
+        <w:ind w:left="288"/>
+        <w:shd w:val="clear" w:color="auto" w:fill="F3F4F6"/>
+      </w:pPr>
+      <w:r>
+        <w:rPr>
+          <w:rFonts w:ascii="Consolas" w:hAnsi="Consolas"/>
+          <w:sz w:val="19"/>
+        </w:rPr>
+        <w:t>apache2ctl -S | grep nivelup</w:t>
+      </w:r>
+    </w:p>
+    <w:p>
+      <w:pPr>
+        <w:spacing w:after="40"/>
+        <w:ind w:left="288"/>
+        <w:shd w:val="clear" w:color="auto" w:fill="F3F4F6"/>
+      </w:pPr>
+      <w:r>
+        <w:rPr>
+          <w:rFonts w:ascii="Consolas" w:hAnsi="Consolas"/>
+          <w:sz w:val="19"/>
+        </w:rPr>
+        <w:t>ls -l /var/www/nivelup | head</w:t>
+      </w:r>
+    </w:p>
+    <w:p>
+      <w:pPr>
+        <w:spacing w:before="80" w:after="180"/>
+        <w:ind w:left="216"/>
+        <w:shd w:val="clear" w:color="auto" w:fill="FEF3C7"/>
+      </w:pPr>
+      <w:r>
+        <w:rPr>
+          <w:b/>
+          <w:sz w:val="21"/>
+        </w:rPr>
+        <w:t>Al llegar a los permisos, señala la pantalla: «ahí está el 640 y el 750 que acabo de mencionar, aplicados de verdad». Enlazar lo dicho con lo mostrado es lo que separa una exposición buena de una que solo recita.</w:t>
+      </w:r>
+    </w:p>
+    <w:p>
+      <w:pPr>
+        <w:spacing w:after="100"/>
+      </w:pPr>
+      <w:r>
+        <w:rPr>
+          <w:b w:val="0"/>
+          <w:i w:val="0"/>
+          <w:sz w:val="21"/>
+        </w:rPr>
+        <w:t>Cierra tu bloque entregando el turno por el nombre: «Piero les muestra los resultados».</w:t>
+      </w:r>
+    </w:p>
+    <w:p>
+      <w:pPr>
+        <w:pStyle w:val="Heading2"/>
+      </w:pPr>
+      <w:r>
+        <w:t>PIERO · El sitio  ·  minutos 5:45 a 8:15</w:t>
+      </w:r>
+    </w:p>
+    <w:p>
+      <w:pPr>
+        <w:spacing w:after="100"/>
+      </w:pPr>
+      <w:r>
+        <w:rPr>
+          <w:b w:val="0"/>
+          <w:i w:val="0"/>
+          <w:sz w:val="21"/>
+        </w:rPr>
+        <w:t>Las diapositivas 12 y 13 tienen capturas, pero úsalas solo como respaldo: navega el sitio de verdad. Alt + Tab al navegador y recorrido sin detenerse, en este orden:</w:t>
       </w:r>
     </w:p>
     <w:p>
@@ -1470,15 +1737,7 @@
     </w:p>
     <w:p>
       <w:pPr>
-        <w:pStyle w:val="Heading2"/>
-      </w:pPr>
-      <w:r>
-        <w:t>Parte B · El servidor  (Daniel, unos 100 segundos)</w:t>
-      </w:r>
-    </w:p>
-    <w:p>
-      <w:pPr>
-        <w:spacing w:after="100"/>
+        <w:spacing w:after="80"/>
       </w:pPr>
       <w:r>
         <w:rPr>
@@ -1486,63 +1745,7 @@
           <w:i w:val="0"/>
           <w:sz w:val="21"/>
         </w:rPr>
-        <w:t>Alt + Tab a PuTTY. Estos comandos, en este orden y ya practicados:</w:t>
-      </w:r>
-    </w:p>
-    <w:p>
-      <w:pPr>
-        <w:spacing w:after="40"/>
-        <w:ind w:left="288"/>
-        <w:shd w:val="clear" w:color="auto" w:fill="F3F4F6"/>
-      </w:pPr>
-      <w:r>
-        <w:rPr>
-          <w:rFonts w:ascii="Consolas" w:hAnsi="Consolas"/>
-          <w:sz w:val="19"/>
-        </w:rPr>
-        <w:t>whoami &amp;&amp; hostname &amp;&amp; lsb_release -d</w:t>
-      </w:r>
-    </w:p>
-    <w:p>
-      <w:pPr>
-        <w:spacing w:after="40"/>
-        <w:ind w:left="288"/>
-        <w:shd w:val="clear" w:color="auto" w:fill="F3F4F6"/>
-      </w:pPr>
-      <w:r>
-        <w:rPr>
-          <w:rFonts w:ascii="Consolas" w:hAnsi="Consolas"/>
-          <w:sz w:val="19"/>
-        </w:rPr>
-        <w:t>apache2 -v &amp;&amp; mysql --version &amp;&amp; php -v</w:t>
-      </w:r>
-    </w:p>
-    <w:p>
-      <w:pPr>
-        <w:spacing w:after="40"/>
-        <w:ind w:left="288"/>
-        <w:shd w:val="clear" w:color="auto" w:fill="F3F4F6"/>
-      </w:pPr>
-      <w:r>
-        <w:rPr>
-          <w:rFonts w:ascii="Consolas" w:hAnsi="Consolas"/>
-          <w:sz w:val="19"/>
-        </w:rPr>
-        <w:t>apache2ctl -S | grep nivelup</w:t>
-      </w:r>
-    </w:p>
-    <w:p>
-      <w:pPr>
-        <w:spacing w:after="40"/>
-        <w:ind w:left="288"/>
-        <w:shd w:val="clear" w:color="auto" w:fill="F3F4F6"/>
-      </w:pPr>
-      <w:r>
-        <w:rPr>
-          <w:rFonts w:ascii="Consolas" w:hAnsi="Consolas"/>
-          <w:sz w:val="19"/>
-        </w:rPr>
-        <w:t>ls -l /var/www/nivelup | head</w:t>
+        <w:t>Y para cerrar tu bloque, el momento más fuerte de toda la exposición. Vuelve a PuTTY con Alt + Tab y ejecuta un solo comando:</w:t>
       </w:r>
     </w:p>
     <w:p>
@@ -1570,7 +1773,7 @@
           <w:b/>
           <w:sz w:val="21"/>
         </w:rPr>
-        <w:t>El último comando es el momento fuerte de toda la exposición: el mensaje que la docente acaba de ver enviarse en el navegador aparece guardado dentro del servidor. Detente ahí dos segundos y déjalo ver.</w:t>
+        <w:t>El mensaje que la docente acaba de verte enviar en el navegador aparece guardado dentro del servidor, con su fecha y su hora. Detente dos segundos y déjalo ver. Ahí quedan demostradas las cuatro piezas del LAMP trabajando encadenadas.</w:t>
       </w:r>
     </w:p>
     <w:p>
@@ -1589,10 +1792,23 @@
     </w:p>
     <w:p>
       <w:pPr>
+        <w:spacing w:after="100"/>
+      </w:pPr>
+      <w:r>
+        <w:rPr>
+          <w:b w:val="0"/>
+          <w:i w:val="0"/>
+          <w:sz w:val="21"/>
+        </w:rPr>
+        <w:t>Entrega el turno: «Anelys cierra con las limitaciones y las conclusiones».</w:t>
+      </w:r>
+    </w:p>
+    <w:p>
+      <w:pPr>
         <w:pStyle w:val="Heading1"/>
       </w:pPr>
       <w:r>
-        <w:t>Diapositivas 14 a 16 · Cierre</w:t>
+        <w:t>ANELYS · Diapositivas 14 a 16  ·  minutos 8:15 a 10:00</w:t>
       </w:r>
     </w:p>
     <w:p>
@@ -1605,7 +1821,33 @@
           <w:i w:val="0"/>
           <w:sz w:val="21"/>
         </w:rPr>
-        <w:t>Piero toma la 14. Las limitaciones son un punto a favor, no una disculpa: demuestran que el equipo sabe qué le falta a su propio trabajo. Pero corrige una antes de exponer:</w:t>
+        <w:t>Tienes el bloque más corto y el más expuesto: es lo último que el jurado escucha y lo que más recuerda. No lo despaches.</w:t>
+      </w:r>
+    </w:p>
+    <w:p>
+      <w:pPr>
+        <w:spacing w:after="40"/>
+      </w:pPr>
+      <w:r>
+        <w:rPr>
+          <w:b/>
+          <w:i w:val="0"/>
+          <w:sz w:val="21"/>
+        </w:rPr>
+        <w:t>Diapositiva 14 · Limitaciones y plan de acción</w:t>
+      </w:r>
+    </w:p>
+    <w:p>
+      <w:pPr>
+        <w:spacing w:after="80"/>
+      </w:pPr>
+      <w:r>
+        <w:rPr>
+          <w:b w:val="0"/>
+          <w:i w:val="0"/>
+          <w:sz w:val="21"/>
+        </w:rPr>
+        <w:t>Las limitaciones son un punto a favor, no una disculpa: demuestran que el equipo sabe qué le falta a su propio trabajo. Menciona dos o tres, no las cinco.</w:t>
       </w:r>
     </w:p>
     <w:p>
@@ -1619,12 +1861,25 @@
           <w:b/>
           <w:sz w:val="21"/>
         </w:rPr>
-        <w:t>La diapositiva dice que la IP se asigna por DHCP y puede cambiar. Ya no es cierto: está fija en 192.168.1.60 con ruta estática. Muévela de limitaciones a logros, o el jurado te preguntará por algo que ya resolviste.</w:t>
+        <w:t>Corrige antes de exponer: la diapositiva dice que la IP se asigna por DHCP y puede cambiar entre reinicios. Ya no es cierto, está fija en 192.168.1.60 con ruta estática. Pasa de limitación a logro, o el jurado te preguntará por algo que ya resolvieron.</w:t>
       </w:r>
     </w:p>
     <w:p>
       <w:pPr>
-        <w:spacing w:after="140"/>
+        <w:spacing w:after="40"/>
+      </w:pPr>
+      <w:r>
+        <w:rPr>
+          <w:b/>
+          <w:i w:val="0"/>
+          <w:sz w:val="21"/>
+        </w:rPr>
+        <w:t>Diapositivas 15 y 16 · Conclusiones y cierre</w:t>
+      </w:r>
+    </w:p>
+    <w:p>
+      <w:pPr>
+        <w:spacing w:after="80"/>
       </w:pPr>
       <w:r>
         <w:rPr>
@@ -1632,7 +1887,7 @@
           <w:i w:val="0"/>
           <w:sz w:val="21"/>
         </w:rPr>
-        <w:t>Anelys cierra con las diapositivas 15 y 16. Dos ideas y nada más:</w:t>
+        <w:t>Dos ideas y nada más:</w:t>
       </w:r>
     </w:p>
     <w:p>

</xml_diff>